<commit_message>
fix(module1): strengthen historical defect regression evidence
将回归参数顺序与缺陷编号对齐，精确断言月份和 Sunday 修复后的日期序列，并在追踪矩阵与附录二中区分源码修复提交和证据提交。\n\nConstraint: 缺陷报告、回归测试和追踪矩阵必须形成一致证据链。\nRejected: 仅断言输出非空 | 无法证明具体缺陷已修复。\nTested: module1 pytest 41 passed；regression 4 passed；DOCX 重新渲染成功；git diff --check。\nConfidence: high\nScope-risk: narrow
</commit_message>
<xml_diff>
--- a/module1/defects/附录2-缺陷报告.docx
+++ b/module1/defects/附录2-缺陷报告.docx
@@ -564,7 +564,7 @@
               <w:rPr>
                 <w:rFonts w:ascii="Arial Unicode MS" w:hAnsi="Arial Unicode MS" w:eastAsia="Arial Unicode MS" w:cs="Arial Unicode MS"/>
               </w:rPr>
-              <w:t>关联回归用例：CRON-UT-034；严重度/优先级：高；高</w:t>
+              <w:t>关联回归用例：CRON-UT-035；严重度/优先级：高；高</w:t>
             </w:r>
           </w:p>
         </w:tc>
@@ -724,7 +724,7 @@
               <w:rPr>
                 <w:rFonts w:ascii="Arial Unicode MS" w:hAnsi="Arial Unicode MS" w:eastAsia="Arial Unicode MS" w:cs="Arial Unicode MS"/>
               </w:rPr>
-              <w:t>余数为 0 时以 step 作为低界。修复提交 101f39e。</w:t>
+              <w:t>余数为 0 时以 step 作为低界。源码修复 07dfad8；证据提交 101f39e。</w:t>
             </w:r>
           </w:p>
         </w:tc>
@@ -948,7 +948,7 @@
               <w:rPr>
                 <w:rFonts w:ascii="Arial Unicode MS" w:hAnsi="Arial Unicode MS" w:eastAsia="Arial Unicode MS" w:cs="Arial Unicode MS"/>
               </w:rPr>
-              <w:t>关联回归用例：CRON-UT-035；严重度/优先级：高；中</w:t>
+              <w:t>关联回归用例：CRON-UT-034；严重度/优先级：高；中</w:t>
             </w:r>
           </w:p>
         </w:tc>
@@ -1108,7 +1108,7 @@
               <w:rPr>
                 <w:rFonts w:ascii="Arial Unicode MS" w:hAnsi="Arial Unicode MS" w:eastAsia="Arial Unicode MS" w:cs="Arial Unicode MS"/>
               </w:rPr>
-              <w:t>改用 isoweekday() % 7。修复提交 10e9bb6。</w:t>
+              <w:t>改用 isoweekday() % 7。源码修复 07dfad8；证据提交 10e9bb6。</w:t>
             </w:r>
           </w:p>
         </w:tc>

</xml_diff>

<commit_message>
fix(module1-docs): align defect IDs with regression cases
统一附录二与需求追踪矩阵中的历史缺陷关联用例：零步长 CRON-UT-033、月份 CRON-UT-034、Sunday CRON-UT-035，并保留 07dfad8 为源码修复提交。\n\nConstraint: 文档、测试和缺陷日志必须引用同一用例编号。\nTested: DOCX 重新渲染成功；结构检查确认三个编号各出现一次；git diff --check。\nConfidence: high\nScope-risk: narrow
</commit_message>
<xml_diff>
--- a/module1/defects/附录2-缺陷报告.docx
+++ b/module1/defects/附录2-缺陷报告.docx
@@ -564,7 +564,7 @@
               <w:rPr>
                 <w:rFonts w:ascii="Arial Unicode MS" w:hAnsi="Arial Unicode MS" w:eastAsia="Arial Unicode MS" w:cs="Arial Unicode MS"/>
               </w:rPr>
-              <w:t>关联回归用例：CRON-UT-035；严重度/优先级：高；高</w:t>
+              <w:t>关联回归用例：CRON-UT-034；严重度/优先级：高；高</w:t>
             </w:r>
           </w:p>
         </w:tc>
@@ -948,7 +948,7 @@
               <w:rPr>
                 <w:rFonts w:ascii="Arial Unicode MS" w:hAnsi="Arial Unicode MS" w:eastAsia="Arial Unicode MS" w:cs="Arial Unicode MS"/>
               </w:rPr>
-              <w:t>关联回归用例：CRON-UT-034；严重度/优先级：高；中</w:t>
+              <w:t>关联回归用例：CRON-UT-035；严重度/优先级：高；中</w:t>
             </w:r>
           </w:p>
         </w:tc>

</xml_diff>